<commit_message>
docs(evidencias): el diario de Lian concuerda con el informe del avance
Tres afirmaciones chocaban con el informe 2.4 que se entrega junto:
- «venimos cumpliendo los plazos»: el informe declara con retraso la
  métrica del detector sobre el video de prueba;
- «obtuvimos tomas en entornos reales» y «usamos IA para sintetizar
  video»: lo decidido el 1-oct fue un video público de obra solo para
  prueba (docs/producto/07-datasets.md);
- «no es necesaria una reestructuración»: el informe asigna a Lian #94
  y #80 para la segunda mitad.

Además: «iniciativa colectivas» → «iniciativas colectivas» y se
cambian tres coloquialismos («súper claro», «cuesta arriba», «dolor de
cabeza»). El resto del texto es el de Lian, sin cambios.

Cómo se comprobó: validate.py de la skill docx («All validations
PASSED!», 57 párrafos → 57) y diff del texto extraído con markitdown:
solo cambian esas frases.

Co-Authored-By: Claude Opus 5.5 <noreply@anthropic.com>
</commit_message>
<xml_diff>
--- a/Fase 2/Evidencias Individuales/Grandon_Lian_2.1_APT122_DiarioReflexionFase2.docx
+++ b/Fase 2/Evidencias Individuales/Grandon_Lian_2.1_APT122_DiarioReflexionFase2.docx
@@ -121,23 +121,7 @@
                 <w:sz w:val="24"/>
                 <w:szCs w:val="24"/>
               </w:rPr>
-              <w:t xml:space="preserve">Esta pauta tiene como objetivo ayudarte a monitorear el desarrollo de tu Proyecto APT, reflexionando sobre tus avances de acuerdo con lo planificado en la fase anterior y recibiendo retroalimentación de tus pares y docentes que te permita hacer los ajustes necesarios para cumplir con los objetivos de tu proyecto. Esta pauta debe ser respondida </w:t>
-            </w:r>
-            <w:r>
-              <w:rPr>
-                <w:rFonts w:eastAsiaTheme="majorEastAsia"/>
-                <w:sz w:val="24"/>
-                <w:szCs w:val="24"/>
-              </w:rPr>
-              <w:t>con tu grupo</w:t>
-            </w:r>
-            <w:r>
-              <w:rPr>
-                <w:rFonts w:eastAsiaTheme="majorEastAsia"/>
-                <w:sz w:val="24"/>
-                <w:szCs w:val="24"/>
-              </w:rPr>
-              <w:t xml:space="preserve">. </w:t>
+              <w:t xml:space="preserve">Esta pauta tiene como objetivo ayudarte a monitorear el desarrollo de tu Proyecto APT, reflexionando sobre tus avances de acuerdo con lo planificado en la fase anterior y recibiendo retroalimentación de tus pares y docentes que te permita hacer los ajustes necesarios para cumplir con los objetivos de tu proyecto. Esta pauta debe ser respondida con tu grupo. </w:t>
             </w:r>
           </w:p>
         </w:tc>
@@ -197,23 +181,7 @@
                 <w:sz w:val="24"/>
                 <w:szCs w:val="24"/>
               </w:rPr>
-              <w:t xml:space="preserve">Puedes completar esta guía y, posteriormente, cargarla en la sección de reflexión de la Fase </w:t>
-            </w:r>
-            <w:r>
-              <w:rPr>
-                <w:rFonts w:eastAsiaTheme="majorEastAsia"/>
-                <w:sz w:val="24"/>
-                <w:szCs w:val="24"/>
-              </w:rPr>
-              <w:t>2</w:t>
-            </w:r>
-            <w:r>
-              <w:rPr>
-                <w:rFonts w:eastAsiaTheme="majorEastAsia"/>
-                <w:sz w:val="24"/>
-                <w:szCs w:val="24"/>
-              </w:rPr>
-              <w:t>, para retroalimentación de tu docente.</w:t>
+              <w:t xml:space="preserve">Puedes completar esta guía y, posteriormente, cargarla en la sección de reflexión de la Fase 2, para retroalimentación de tu docente.</w:t>
             </w:r>
           </w:p>
         </w:tc>
@@ -286,25 +254,7 @@
                 <w:sz w:val="24"/>
                 <w:szCs w:val="24"/>
               </w:rPr>
-              <w:t xml:space="preserve">1. Mira </w:t>
-            </w:r>
-            <w:proofErr w:type="spellStart"/>
-            <w:r>
-              <w:rPr>
-                <w:rFonts w:eastAsiaTheme="majorEastAsia"/>
-                <w:sz w:val="24"/>
-                <w:szCs w:val="24"/>
-              </w:rPr>
-              <w:t>tu</w:t>
-            </w:r>
-            <w:proofErr w:type="spellEnd"/>
-            <w:r>
-              <w:rPr>
-                <w:rFonts w:eastAsiaTheme="majorEastAsia"/>
-                <w:sz w:val="24"/>
-                <w:szCs w:val="24"/>
-              </w:rPr>
-              <w:t xml:space="preserve"> carta Gantt y reflexiona sobre los avances de tu Proyecto APT</w:t>
+              <w:t xml:space="preserve">1. Mira tu carta Gantt y reflexiona sobre los avances de tu Proyecto APT</w:t>
             </w:r>
           </w:p>
         </w:tc>
@@ -355,7 +305,7 @@
                 <w:sz w:val="24"/>
                 <w:szCs w:val="24"/>
               </w:rPr>
-              <w:t>Hasta la fecha venimos cumpliendo los plazos e incluso logramos adelantar algunas tareas clave de la programación y la estructura base del sistema. Lo que más nos ayudó a fluir bien fue coordinarnos desde el primer día y tener súper claro qué le correspondía hacer a cada uno, lo que evitó topes o duplicar esfuerzos. Lo que sí nos puso cuesta arriba el camino fue la recolección de videos: para evaluar y entrenar bien la detección del modelo necesitábamos material en video con ciertas condiciones y ángulos, y conseguir clips que realmente nos sirvieran fue un dolor de cabeza que ralentizó esa etapa.</w:t>
+              <w:t>Hasta la fecha cumplimos la mayoría de los plazos e incluso adelantamos tareas clave de la programación y la estructura base del sistema; lo que va con retraso es la medición del detector sobre el video de prueba. Lo que más nos ayudó a fluir bien fue coordinarnos desde el primer día y tener muy claro qué le correspondía hacer a cada uno, lo que evitó topes o duplicar esfuerzos. Lo que más nos dificultó fue la recolección de videos: para evaluar y entrenar bien la detección del modelo necesitábamos material en video con ciertas condiciones y ángulos, y conseguir clips que realmente nos sirvieran fue difícil y ralentizó esa etapa.</w:t>
             </w:r>
           </w:p>
           <w:p>
@@ -500,72 +450,7 @@
                 <w:sz w:val="24"/>
                 <w:szCs w:val="24"/>
               </w:rPr>
-              <w:t xml:space="preserve">Para no quedarnos frenados esperando material real, optamos por diversificar las fuentes de datos. Por un lado, usamos herramientas de IA para sintetizar secuencias de video de prueba; por otro, </w:t>
-            </w:r>
-            <w:r>
-              <w:rPr>
-                <w:rFonts w:eastAsiaTheme="majorEastAsia"/>
-                <w:color w:val="767171" w:themeColor="background2" w:themeShade="80"/>
-                <w:sz w:val="24"/>
-                <w:szCs w:val="24"/>
-              </w:rPr>
-              <w:t xml:space="preserve">obtuvimos </w:t>
-            </w:r>
-            <w:r>
-              <w:rPr>
-                <w:rFonts w:eastAsiaTheme="majorEastAsia"/>
-                <w:color w:val="767171" w:themeColor="background2" w:themeShade="80"/>
-                <w:sz w:val="24"/>
-                <w:szCs w:val="24"/>
-              </w:rPr>
-              <w:t xml:space="preserve">tomas en entornos reales y espacios públicos que nos dieran referencias útiles. También consideramos actuar o escenificar nosotros </w:t>
-            </w:r>
-            <w:proofErr w:type="gramStart"/>
-            <w:r>
-              <w:rPr>
-                <w:rFonts w:eastAsiaTheme="majorEastAsia"/>
-                <w:color w:val="767171" w:themeColor="background2" w:themeShade="80"/>
-                <w:sz w:val="24"/>
-                <w:szCs w:val="24"/>
-              </w:rPr>
-              <w:t>mismos situaciones específicas</w:t>
-            </w:r>
-            <w:proofErr w:type="gramEnd"/>
-            <w:r>
-              <w:rPr>
-                <w:rFonts w:eastAsiaTheme="majorEastAsia"/>
-                <w:color w:val="767171" w:themeColor="background2" w:themeShade="80"/>
-                <w:sz w:val="24"/>
-                <w:szCs w:val="24"/>
-              </w:rPr>
-              <w:t xml:space="preserve"> con el equipamiento necesario para generar pruebas a la medida del sistema. </w:t>
-            </w:r>
-            <w:r>
-              <w:rPr>
-                <w:rFonts w:eastAsiaTheme="majorEastAsia"/>
-                <w:color w:val="767171" w:themeColor="background2" w:themeShade="80"/>
-                <w:sz w:val="24"/>
-                <w:szCs w:val="24"/>
-              </w:rPr>
-              <w:t xml:space="preserve">Pero finalmente, pudimos sacar adelante todo, con el material </w:t>
-            </w:r>
-            <w:r>
-              <w:rPr>
-                <w:rFonts w:eastAsiaTheme="majorEastAsia"/>
-                <w:color w:val="767171" w:themeColor="background2" w:themeShade="80"/>
-                <w:sz w:val="24"/>
-                <w:szCs w:val="24"/>
-              </w:rPr>
-              <w:t>recolectado</w:t>
-            </w:r>
-            <w:r>
-              <w:rPr>
-                <w:rFonts w:eastAsiaTheme="majorEastAsia"/>
-                <w:color w:val="767171" w:themeColor="background2" w:themeShade="80"/>
-                <w:sz w:val="24"/>
-                <w:szCs w:val="24"/>
-              </w:rPr>
-              <w:t>.</w:t>
+              <w:t xml:space="preserve">Para no quedarnos frenados esperando material real, optamos por diversificar las fuentes de datos. Evaluamos varias alternativas: generar secuencias de video con herramientas de IA, buscar tomas de entornos reales y escenificar nosotros mismos situaciones específicas con el equipamiento necesario. Finalmente, el 1 de octubre decidimos usar un video público de cámaras de una obra solo para probar y demostrar el sistema, nunca para entrenar, y entrenar el modelo con conjuntos de datos públicos. Con ese material pudimos sacar adelante el trabajo.</w:t>
             </w:r>
           </w:p>
           <w:p>
@@ -740,39 +625,7 @@
                 <w:sz w:val="24"/>
                 <w:szCs w:val="24"/>
               </w:rPr>
-              <w:t>¿Cómo evalúas tu</w:t>
-            </w:r>
-            <w:r>
-              <w:rPr>
-                <w:rFonts w:eastAsiaTheme="majorEastAsia"/>
-                <w:sz w:val="24"/>
-                <w:szCs w:val="24"/>
-              </w:rPr>
-              <w:t xml:space="preserve"> trabajo</w:t>
-            </w:r>
-            <w:r>
-              <w:rPr>
-                <w:rFonts w:eastAsiaTheme="majorEastAsia"/>
-                <w:sz w:val="24"/>
-                <w:szCs w:val="24"/>
-              </w:rPr>
-              <w:t>? ¿Qué destacas y qué podrías hacer para mejorar tu</w:t>
-            </w:r>
-            <w:r>
-              <w:rPr>
-                <w:rFonts w:eastAsiaTheme="majorEastAsia"/>
-                <w:sz w:val="24"/>
-                <w:szCs w:val="24"/>
-              </w:rPr>
-              <w:t xml:space="preserve"> trabajo</w:t>
-            </w:r>
-            <w:r>
-              <w:rPr>
-                <w:rFonts w:eastAsiaTheme="majorEastAsia"/>
-                <w:sz w:val="24"/>
-                <w:szCs w:val="24"/>
-              </w:rPr>
-              <w:t xml:space="preserve">? </w:t>
+              <w:t xml:space="preserve">¿Cómo evalúas tu trabajo? ¿Qué destacas y qué podrías hacer para mejorar tu trabajo? </w:t>
             </w:r>
           </w:p>
           <w:p>
@@ -924,46 +777,9 @@
                 <w:sz w:val="24"/>
                 <w:szCs w:val="24"/>
               </w:rPr>
-              <w:t>Mi</w:t>
-            </w:r>
-            <w:r>
-              <w:rPr>
-                <w:rFonts w:eastAsiaTheme="majorEastAsia"/>
-                <w:sz w:val="24"/>
-                <w:szCs w:val="24"/>
-              </w:rPr>
-              <w:t xml:space="preserve"> principal duda actual radica en el balance entre el tiempo de procesamiento y la precisión de la detección en tiempo real al integrar el modelo con el resto del sistema.</w:t>
-            </w:r>
-            <w:r>
-              <w:rPr>
-                <w:rFonts w:eastAsiaTheme="majorEastAsia"/>
-                <w:sz w:val="24"/>
-                <w:szCs w:val="24"/>
-              </w:rPr>
-              <w:t xml:space="preserve"> Por lo que mi pregunta podría ser: </w:t>
-            </w:r>
-            <w:r>
-              <w:rPr>
-                <w:rFonts w:eastAsiaTheme="majorEastAsia"/>
-                <w:sz w:val="24"/>
-                <w:szCs w:val="24"/>
-              </w:rPr>
+              <w:t xml:space="preserve">Mi principal duda actual radica en el balance entre el tiempo de procesamiento y la precisión de la detección en tiempo real al integrar el modelo con el resto del sistema. Por lo que mi pregunta podría ser: </w:t>
               <w:br/>
-            </w:r>
-            <w:r>
-              <w:rPr>
-                <w:rFonts w:eastAsiaTheme="majorEastAsia"/>
-                <w:sz w:val="24"/>
-                <w:szCs w:val="24"/>
-              </w:rPr>
               <w:br/>
-            </w:r>
-            <w:r>
-              <w:rPr>
-                <w:rFonts w:eastAsiaTheme="majorEastAsia"/>
-                <w:sz w:val="24"/>
-                <w:szCs w:val="24"/>
-              </w:rPr>
               <w:t>¿Han experimentado pérdidas de rendimiento o latencia al procesar video en tiempo real, y qué librerías o técnicas de optimización les han funcionado mejor?</w:t>
             </w:r>
           </w:p>
@@ -1121,7 +937,7 @@
                 <w:sz w:val="24"/>
                 <w:szCs w:val="24"/>
               </w:rPr>
-              <w:t>No consideramos necesario realizar una reestructuración drástica de la distribución actual, ya que el reparto de roles ha funcionado muy bien y nos permitió adelantar tareas.</w:t>
+              <w:t>No consideramos necesario realizar una reestructuración drástica de la distribución actual, ya que el reparto de roles ha funcionado muy bien y nos permitió adelantar tareas. Para la segunda mitad sí se me asignan la accesibilidad de la pantalla de reglas y la ejecución del plan de pruebas manuales, para equilibrar la carga del equipo.</w:t>
             </w:r>
           </w:p>
         </w:tc>
@@ -1194,26 +1010,8 @@
                 <w:sz w:val="24"/>
                 <w:szCs w:val="24"/>
               </w:rPr>
-              <w:t>6</w:t>
+              <w:t xml:space="preserve">6. APT  grupal</w:t>
             </w:r>
-            <w:r>
-              <w:rPr>
-                <w:rFonts w:eastAsiaTheme="majorEastAsia"/>
-                <w:sz w:val="24"/>
-                <w:szCs w:val="24"/>
-              </w:rPr>
-              <w:t xml:space="preserve">. </w:t>
-            </w:r>
-            <w:proofErr w:type="gramStart"/>
-            <w:r>
-              <w:rPr>
-                <w:rFonts w:eastAsiaTheme="majorEastAsia"/>
-                <w:sz w:val="24"/>
-                <w:szCs w:val="24"/>
-              </w:rPr>
-              <w:t>APT  grupal</w:t>
-            </w:r>
-            <w:proofErr w:type="gramEnd"/>
           </w:p>
         </w:tc>
       </w:tr>
@@ -1316,52 +1114,7 @@
                 <w:sz w:val="24"/>
                 <w:szCs w:val="24"/>
               </w:rPr>
-              <w:t xml:space="preserve">Cumplimos rigurosamente con </w:t>
-            </w:r>
-            <w:r>
-              <w:rPr>
-                <w:rFonts w:eastAsiaTheme="majorEastAsia"/>
-                <w:color w:val="767171" w:themeColor="background2" w:themeShade="80"/>
-                <w:sz w:val="24"/>
-                <w:szCs w:val="24"/>
-              </w:rPr>
-              <w:t>las entregas e iniciativa colectiva</w:t>
-            </w:r>
-            <w:r>
-              <w:rPr>
-                <w:rFonts w:eastAsiaTheme="majorEastAsia"/>
-                <w:color w:val="767171" w:themeColor="background2" w:themeShade="80"/>
-                <w:sz w:val="24"/>
-                <w:szCs w:val="24"/>
-              </w:rPr>
-              <w:t>s</w:t>
-            </w:r>
-            <w:r>
-              <w:rPr>
-                <w:rFonts w:eastAsiaTheme="majorEastAsia"/>
-                <w:color w:val="767171" w:themeColor="background2" w:themeShade="80"/>
-                <w:sz w:val="24"/>
-                <w:szCs w:val="24"/>
-              </w:rPr>
-              <w:t xml:space="preserve"> para solucionar bloqueos (como la búsqueda activa de soluciones alternativas para la recolección de video).</w:t>
-            </w:r>
-            <w:r>
-              <w:rPr>
-                <w:rFonts w:eastAsiaTheme="majorEastAsia"/>
-                <w:color w:val="767171" w:themeColor="background2" w:themeShade="80"/>
-                <w:sz w:val="24"/>
-                <w:szCs w:val="24"/>
-              </w:rPr>
-              <w:t xml:space="preserve"> Además, tenemos facilidad</w:t>
-            </w:r>
-            <w:r>
-              <w:rPr>
-                <w:rFonts w:eastAsiaTheme="majorEastAsia"/>
-                <w:color w:val="767171" w:themeColor="background2" w:themeShade="80"/>
-                <w:sz w:val="24"/>
-                <w:szCs w:val="24"/>
-              </w:rPr>
-              <w:t xml:space="preserve"> para discutir aspectos técnicos y resolver dudas de manera oportuna sin generar conflicto.</w:t>
+              <w:t xml:space="preserve">Cumplimos con las entregas y tomamos iniciativas colectivas para solucionar bloqueos (como la búsqueda activa de soluciones alternativas para la recolección de video). Además, tenemos facilidad para discutir aspectos técnicos y resolver dudas de manera oportuna sin generar conflicto.</w:t>
             </w:r>
           </w:p>
           <w:p>

</xml_diff>